<commit_message>
fix(document-engine): the tests keep a question with its options, and title both copies alike
Options keep their lines and the first two keep with the next (the sweep's cap of
three), so a question no longer splits from its options. 5.1's title carries
"(ANGAJARE / REINSTRUIRE)" inline on both copies; the pictogram labels no longer
touch their borders; "Legea nr. 90/ 2002"; 5.2 "în afara" twice per copy.

Claude-Session: https://claude.ai/code/session_01A9qjCHVH6kcDAEKFiJoShR
</commit_message>
<xml_diff>
--- a/packages/document-engine/templates/5.1_test_hiring.docx
+++ b/packages/document-engine/templates/5.1_test_hiring.docx
@@ -5,9 +5,9 @@
     <w:p>
       <w:pPr>
         <w:pStyle w:val="Normal"/>
-        <w:keepNext w:val="true"/>
+        <w:keepNext w:val="false"/>
         <w:widowControl/>
-        <w:spacing w:before="0" w:after="0"/>
+        <w:spacing w:before="0" w:after="240"/>
         <w:ind w:hanging="0"/>
         <w:jc w:val="center"/>
         <w:rPr>
@@ -31,37 +31,7 @@
           <w:szCs w:val="20"/>
           <w:lang w:val="ro-RO"/>
         </w:rPr>
-        <w:t>TESTARE DE VERIFICARE A CUNOȘTINȚELOR PRIVIND SECURITATEA ȘI SĂNĂTATEA ÎN MUNCĂ</w:t>
-      </w:r>
-    </w:p>
-    <w:p>
-      <w:pPr>
-        <w:pStyle w:val="Normal"/>
-        <w:widowControl/>
-        <w:spacing w:before="0" w:after="240"/>
-        <w:ind w:hanging="0"/>
-        <w:jc w:val="center"/>
-        <w:rPr>
-          <w:rFonts w:ascii="Arial" w:hAnsi="Arial" w:cs="Arial"/>
-          <w:b/>
-          <w:bCs/>
-          <w:sz w:val="18"/>
-          <w:szCs w:val="18"/>
-          <w:lang w:val="it-IT"/>
-        </w:rPr>
-      </w:pPr>
-      <w:r>
-        <w:rPr>
-          <w:rFonts w:eastAsia="Arial" w:cs="Arial" w:ascii="Arial" w:hAnsi="Arial"/>
-          <w:b/>
-          <w:color w:val="auto"/>
-          <w:spacing w:val="0"/>
-          <w:w w:val="100"/>
-          <w:sz w:val="20"/>
-          <w:szCs w:val="20"/>
-          <w:lang w:val="ro-RO"/>
-        </w:rPr>
-        <w:t>(ANGAJARE / REINSTRUIRE)</w:t>
+        <w:t xml:space="preserve">TESTARE DE VERIFICARE A CUNOȘTINȚELOR PRIVIND SECURITATEA ȘI SĂNĂTATEA ÎN MUNCĂ (ANGAJARE / REINSTRUIRE)</w:t>
       </w:r>
     </w:p>
     <w:p>
@@ -111,6 +81,8 @@
     <w:p>
       <w:pPr>
         <w:pStyle w:val="Normal"/>
+        <w:keepNext w:val="true"/>
+        <w:keepLines w:val="true"/>
         <w:widowControl/>
         <w:numPr>
           <w:ilvl w:val="0"/>
@@ -134,12 +106,14 @@
           <w:szCs w:val="20"/>
           <w:lang w:val="ro-RO"/>
         </w:rPr>
-        <w:t>Legea nr.: 90/ 2002;</w:t>
+        <w:t>Legea nr. 90/ 2002;</w:t>
       </w:r>
     </w:p>
     <w:p>
       <w:pPr>
         <w:pStyle w:val="Normal"/>
+        <w:keepNext w:val="true"/>
+        <w:keepLines w:val="true"/>
         <w:widowControl/>
         <w:numPr>
           <w:ilvl w:val="0"/>
@@ -163,12 +137,13 @@
           <w:szCs w:val="20"/>
           <w:lang w:val="ro-RO"/>
         </w:rPr>
-        <w:t>Legea nr.: 319/ 2006;</w:t>
+        <w:t>Legea nr. 319/ 2006;</w:t>
       </w:r>
     </w:p>
     <w:p>
       <w:pPr>
         <w:pStyle w:val="Normal"/>
+        <w:keepLines w:val="true"/>
         <w:widowControl/>
         <w:numPr>
           <w:ilvl w:val="0"/>
@@ -242,6 +217,8 @@
     <w:p>
       <w:pPr>
         <w:pStyle w:val="Normal"/>
+        <w:keepNext w:val="true"/>
+        <w:keepLines w:val="true"/>
         <w:widowControl/>
         <w:numPr>
           <w:ilvl w:val="0"/>
@@ -272,6 +249,8 @@
     <w:p>
       <w:pPr>
         <w:pStyle w:val="Normal"/>
+        <w:keepNext w:val="true"/>
+        <w:keepLines w:val="true"/>
         <w:widowControl/>
         <w:numPr>
           <w:ilvl w:val="0"/>
@@ -301,6 +280,7 @@
     <w:p>
       <w:pPr>
         <w:pStyle w:val="Normal"/>
+        <w:keepLines w:val="true"/>
         <w:widowControl/>
         <w:numPr>
           <w:ilvl w:val="0"/>
@@ -375,6 +355,8 @@
     <w:p>
       <w:pPr>
         <w:pStyle w:val="Normal"/>
+        <w:keepNext w:val="true"/>
+        <w:keepLines w:val="true"/>
         <w:widowControl/>
         <w:numPr>
           <w:ilvl w:val="0"/>
@@ -405,6 +387,8 @@
     <w:p>
       <w:pPr>
         <w:pStyle w:val="Normal"/>
+        <w:keepNext w:val="true"/>
+        <w:keepLines w:val="true"/>
         <w:widowControl/>
         <w:numPr>
           <w:ilvl w:val="0"/>
@@ -435,6 +419,7 @@
     <w:p>
       <w:pPr>
         <w:pStyle w:val="Normal"/>
+        <w:keepLines w:val="true"/>
         <w:widowControl/>
         <w:numPr>
           <w:ilvl w:val="0"/>
@@ -509,6 +494,8 @@
     <w:p>
       <w:pPr>
         <w:pStyle w:val="Normal"/>
+        <w:keepNext w:val="true"/>
+        <w:keepLines w:val="true"/>
         <w:widowControl/>
         <w:numPr>
           <w:ilvl w:val="0"/>
@@ -538,6 +525,8 @@
     <w:p>
       <w:pPr>
         <w:pStyle w:val="Normal"/>
+        <w:keepNext w:val="true"/>
+        <w:keepLines w:val="true"/>
         <w:widowControl/>
         <w:numPr>
           <w:ilvl w:val="0"/>
@@ -567,6 +556,7 @@
     <w:p>
       <w:pPr>
         <w:pStyle w:val="Normal"/>
+        <w:keepLines w:val="true"/>
         <w:widowControl/>
         <w:numPr>
           <w:ilvl w:val="0"/>
@@ -639,6 +629,8 @@
     <w:p>
       <w:pPr>
         <w:pStyle w:val="Normal"/>
+        <w:keepNext w:val="true"/>
+        <w:keepLines w:val="true"/>
         <w:widowControl/>
         <w:numPr>
           <w:ilvl w:val="0"/>
@@ -669,6 +661,8 @@
     <w:p>
       <w:pPr>
         <w:pStyle w:val="Normal"/>
+        <w:keepNext w:val="true"/>
+        <w:keepLines w:val="true"/>
         <w:widowControl/>
         <w:numPr>
           <w:ilvl w:val="0"/>
@@ -699,6 +693,7 @@
     <w:p>
       <w:pPr>
         <w:pStyle w:val="Normal"/>
+        <w:keepLines w:val="true"/>
         <w:widowControl/>
         <w:numPr>
           <w:ilvl w:val="0"/>
@@ -773,6 +768,8 @@
     <w:p>
       <w:pPr>
         <w:pStyle w:val="BodyText"/>
+        <w:keepNext w:val="true"/>
+        <w:keepLines w:val="true"/>
         <w:widowControl/>
         <w:numPr>
           <w:ilvl w:val="0"/>
@@ -803,6 +800,8 @@
     <w:p>
       <w:pPr>
         <w:pStyle w:val="BodyText"/>
+        <w:keepNext w:val="true"/>
+        <w:keepLines w:val="true"/>
         <w:widowControl/>
         <w:numPr>
           <w:ilvl w:val="0"/>
@@ -833,6 +832,7 @@
     <w:p>
       <w:pPr>
         <w:pStyle w:val="BodyText"/>
+        <w:keepLines w:val="true"/>
         <w:widowControl/>
         <w:numPr>
           <w:ilvl w:val="0"/>
@@ -907,6 +907,8 @@
     <w:p>
       <w:pPr>
         <w:pStyle w:val="Normal"/>
+        <w:keepNext w:val="true"/>
+        <w:keepLines w:val="true"/>
         <w:widowControl/>
         <w:numPr>
           <w:ilvl w:val="0"/>
@@ -937,6 +939,8 @@
     <w:p>
       <w:pPr>
         <w:pStyle w:val="Normal"/>
+        <w:keepNext w:val="true"/>
+        <w:keepLines w:val="true"/>
         <w:widowControl/>
         <w:numPr>
           <w:ilvl w:val="0"/>
@@ -967,6 +971,7 @@
     <w:p>
       <w:pPr>
         <w:pStyle w:val="Normal"/>
+        <w:keepLines w:val="true"/>
         <w:widowControl/>
         <w:numPr>
           <w:ilvl w:val="0"/>
@@ -1041,6 +1046,8 @@
     <w:p>
       <w:pPr>
         <w:pStyle w:val="Normal"/>
+        <w:keepNext w:val="true"/>
+        <w:keepLines w:val="true"/>
         <w:widowControl/>
         <w:numPr>
           <w:ilvl w:val="0"/>
@@ -1070,6 +1077,8 @@
     <w:p>
       <w:pPr>
         <w:pStyle w:val="Normal"/>
+        <w:keepNext w:val="true"/>
+        <w:keepLines w:val="true"/>
         <w:widowControl/>
         <w:numPr>
           <w:ilvl w:val="0"/>
@@ -1100,6 +1109,7 @@
     <w:p>
       <w:pPr>
         <w:pStyle w:val="Normal"/>
+        <w:keepLines w:val="true"/>
         <w:widowControl/>
         <w:numPr>
           <w:ilvl w:val="0"/>
@@ -1174,6 +1184,8 @@
     <w:p>
       <w:pPr>
         <w:pStyle w:val="Normal"/>
+        <w:keepNext w:val="true"/>
+        <w:keepLines w:val="true"/>
         <w:widowControl/>
         <w:numPr>
           <w:ilvl w:val="1"/>
@@ -1204,6 +1216,8 @@
     <w:p>
       <w:pPr>
         <w:pStyle w:val="Normal"/>
+        <w:keepNext w:val="true"/>
+        <w:keepLines w:val="true"/>
         <w:widowControl/>
         <w:numPr>
           <w:ilvl w:val="1"/>
@@ -1234,6 +1248,7 @@
     <w:p>
       <w:pPr>
         <w:pStyle w:val="Normal"/>
+        <w:keepLines w:val="true"/>
         <w:widowControl/>
         <w:numPr>
           <w:ilvl w:val="1"/>
@@ -1323,6 +1338,8 @@
     <w:p>
       <w:pPr>
         <w:pStyle w:val="Normal"/>
+        <w:keepNext w:val="true"/>
+        <w:keepLines w:val="true"/>
         <w:widowControl/>
         <w:numPr>
           <w:ilvl w:val="0"/>
@@ -1354,6 +1371,7 @@
       <w:pPr>
         <w:pStyle w:val="Normal"/>
         <w:keepNext w:val="true"/>
+        <w:keepLines w:val="true"/>
         <w:widowControl/>
         <w:numPr>
           <w:ilvl w:val="0"/>
@@ -2048,6 +2066,10 @@
               <w:bottom w:val="single" w:sz="4" w:space="0" w:color="000000"/>
               <w:right w:val="double" w:sz="4" w:space="0" w:color="000000"/>
             </w:tcBorders>
+            <w:tcMar>
+              <w:top w:w="57" w:type="dxa"/>
+              <w:bottom w:w="57" w:type="dxa"/>
+            </w:tcMar>
             <w:vAlign w:val="center"/>
           </w:tcPr>
           <w:p>
@@ -2060,8 +2082,8 @@
                 <w:rFonts w:ascii="Arial" w:hAnsi="Arial" w:cs="Arial"/>
                 <w:b/>
                 <w:bCs/>
-                <w:sz w:val="16"/>
-                <w:szCs w:val="16"/>
+                <w:sz w:val="14"/>
+                <w:szCs w:val="14"/>
                 <w:lang w:val="fr-FR"/>
               </w:rPr>
             </w:pPr>
@@ -2073,7 +2095,7 @@
                 <w:spacing w:val="0"/>
                 <w:w w:val="100"/>
                 <w:sz w:val="14"/>
-                <w:szCs w:val="16"/>
+                <w:szCs w:val="14"/>
                 <w:lang w:val="ro-RO"/>
               </w:rPr>
               <w:t>INTERZIS ACCESUL PIETONILOR</w:t>
@@ -2089,6 +2111,10 @@
               <w:bottom w:val="single" w:sz="4" w:space="0" w:color="000000"/>
               <w:right w:val="double" w:sz="4" w:space="0" w:color="000000"/>
             </w:tcBorders>
+            <w:tcMar>
+              <w:top w:w="57" w:type="dxa"/>
+              <w:bottom w:w="57" w:type="dxa"/>
+            </w:tcMar>
             <w:vAlign w:val="center"/>
           </w:tcPr>
           <w:p>
@@ -2096,14 +2122,13 @@
               <w:pStyle w:val="Normal"/>
               <w:widowControl/>
               <w:spacing w:before="0" w:after="0"/>
-              <w:ind w:left="-155" w:right="-108"/>
               <w:jc w:val="center"/>
               <w:rPr>
                 <w:rFonts w:ascii="Arial" w:hAnsi="Arial" w:cs="Arial"/>
                 <w:b/>
                 <w:bCs/>
-                <w:sz w:val="16"/>
-                <w:szCs w:val="16"/>
+                <w:sz w:val="14"/>
+                <w:szCs w:val="14"/>
                 <w:lang w:val="pt-BR"/>
               </w:rPr>
             </w:pPr>
@@ -2115,10 +2140,10 @@
                 <w:spacing w:val="0"/>
                 <w:w w:val="100"/>
                 <w:sz w:val="14"/>
-                <w:szCs w:val="16"/>
+                <w:szCs w:val="14"/>
                 <w:lang w:val="ro-RO"/>
               </w:rPr>
-              <w:t>NU ATINGE! PERICOL DE ELECTROCUTARE</w:t>
+              <w:t>NU ATINGE! PERICOL DE ELECTRO­CUTARE</w:t>
             </w:r>
           </w:p>
         </w:tc>
@@ -2131,6 +2156,10 @@
               <w:bottom w:val="single" w:sz="4" w:space="0" w:color="000000"/>
               <w:right w:val="double" w:sz="4" w:space="0" w:color="000000"/>
             </w:tcBorders>
+            <w:tcMar>
+              <w:top w:w="57" w:type="dxa"/>
+              <w:bottom w:w="57" w:type="dxa"/>
+            </w:tcMar>
             <w:vAlign w:val="center"/>
           </w:tcPr>
           <w:p>
@@ -2155,7 +2184,7 @@
                 <w:spacing w:val="0"/>
                 <w:w w:val="100"/>
                 <w:sz w:val="14"/>
-                <w:szCs w:val="16"/>
+                <w:szCs w:val="14"/>
                 <w:lang w:val="ro-RO"/>
               </w:rPr>
               <w:t>MATERIALE INFLAMABILE</w:t>
@@ -2171,6 +2200,10 @@
               <w:bottom w:val="single" w:sz="4" w:space="0" w:color="000000"/>
               <w:right w:val="double" w:sz="4" w:space="0" w:color="000000"/>
             </w:tcBorders>
+            <w:tcMar>
+              <w:top w:w="57" w:type="dxa"/>
+              <w:bottom w:w="57" w:type="dxa"/>
+            </w:tcMar>
             <w:vAlign w:val="center"/>
           </w:tcPr>
           <w:p>
@@ -2183,8 +2216,8 @@
                 <w:rFonts w:ascii="Arial" w:hAnsi="Arial" w:cs="Arial"/>
                 <w:b/>
                 <w:bCs/>
-                <w:sz w:val="16"/>
-                <w:szCs w:val="16"/>
+                <w:sz w:val="14"/>
+                <w:szCs w:val="14"/>
                 <w:lang w:val="fr-FR"/>
               </w:rPr>
             </w:pPr>
@@ -2196,7 +2229,7 @@
                 <w:spacing w:val="0"/>
                 <w:w w:val="100"/>
                 <w:sz w:val="14"/>
-                <w:szCs w:val="16"/>
+                <w:szCs w:val="14"/>
                 <w:lang w:val="ro-RO"/>
               </w:rPr>
               <w:t>PERICOL GENERAL</w:t>
@@ -2212,6 +2245,10 @@
               <w:bottom w:val="single" w:sz="4" w:space="0" w:color="000000"/>
               <w:right w:val="double" w:sz="4" w:space="0" w:color="000000"/>
             </w:tcBorders>
+            <w:tcMar>
+              <w:top w:w="57" w:type="dxa"/>
+              <w:bottom w:w="57" w:type="dxa"/>
+            </w:tcMar>
             <w:vAlign w:val="center"/>
           </w:tcPr>
           <w:p>
@@ -2237,7 +2274,7 @@
                 <w:spacing w:val="0"/>
                 <w:w w:val="100"/>
                 <w:sz w:val="14"/>
-                <w:szCs w:val="16"/>
+                <w:szCs w:val="14"/>
                 <w:lang w:val="ro-RO"/>
               </w:rPr>
               <w:t>PROTECȚIA MÂINILOR OBLIGATORIE</w:t>
@@ -2253,6 +2290,10 @@
               <w:bottom w:val="single" w:sz="4" w:space="0" w:color="000000"/>
               <w:right w:val="double" w:sz="4" w:space="0" w:color="000000"/>
             </w:tcBorders>
+            <w:tcMar>
+              <w:top w:w="57" w:type="dxa"/>
+              <w:bottom w:w="57" w:type="dxa"/>
+            </w:tcMar>
             <w:vAlign w:val="center"/>
           </w:tcPr>
           <w:p>
@@ -2265,8 +2306,8 @@
                 <w:rFonts w:ascii="Arial" w:hAnsi="Arial" w:cs="Arial"/>
                 <w:b/>
                 <w:bCs/>
-                <w:sz w:val="16"/>
-                <w:szCs w:val="16"/>
+                <w:sz w:val="14"/>
+                <w:szCs w:val="14"/>
                 <w:lang w:val="fr-FR"/>
               </w:rPr>
             </w:pPr>
@@ -2278,7 +2319,7 @@
                 <w:spacing w:val="0"/>
                 <w:w w:val="100"/>
                 <w:sz w:val="14"/>
-                <w:szCs w:val="16"/>
+                <w:szCs w:val="14"/>
                 <w:lang w:val="ro-RO"/>
               </w:rPr>
               <w:t>LOC DE FUMAT</w:t>
@@ -2294,6 +2335,10 @@
               <w:bottom w:val="single" w:sz="4" w:space="0" w:color="000000"/>
               <w:right w:val="double" w:sz="4" w:space="0" w:color="000000"/>
             </w:tcBorders>
+            <w:tcMar>
+              <w:top w:w="57" w:type="dxa"/>
+              <w:bottom w:w="57" w:type="dxa"/>
+            </w:tcMar>
             <w:vAlign w:val="center"/>
           </w:tcPr>
           <w:p>
@@ -2306,8 +2351,8 @@
                 <w:rFonts w:ascii="Arial" w:hAnsi="Arial" w:cs="Arial"/>
                 <w:b/>
                 <w:bCs/>
-                <w:sz w:val="16"/>
-                <w:szCs w:val="16"/>
+                <w:sz w:val="14"/>
+                <w:szCs w:val="14"/>
                 <w:lang w:val="fr-FR"/>
               </w:rPr>
             </w:pPr>
@@ -2319,7 +2364,7 @@
                 <w:spacing w:val="0"/>
                 <w:w w:val="100"/>
                 <w:sz w:val="14"/>
-                <w:szCs w:val="16"/>
+                <w:szCs w:val="14"/>
                 <w:lang w:val="ro-RO"/>
               </w:rPr>
               <w:t>STINGĂTOR</w:t>
@@ -2335,6 +2380,10 @@
               <w:bottom w:val="single" w:sz="4" w:space="0" w:color="000000"/>
               <w:right w:val="single" w:sz="4" w:space="0" w:color="000000"/>
             </w:tcBorders>
+            <w:tcMar>
+              <w:top w:w="57" w:type="dxa"/>
+              <w:bottom w:w="57" w:type="dxa"/>
+            </w:tcMar>
             <w:vAlign w:val="center"/>
           </w:tcPr>
           <w:p>
@@ -2347,8 +2396,8 @@
                 <w:rFonts w:ascii="Arial" w:hAnsi="Arial" w:cs="Arial"/>
                 <w:b/>
                 <w:bCs/>
-                <w:sz w:val="16"/>
-                <w:szCs w:val="16"/>
+                <w:sz w:val="14"/>
+                <w:szCs w:val="14"/>
                 <w:lang w:val="fr-FR"/>
               </w:rPr>
             </w:pPr>
@@ -2360,7 +2409,7 @@
                 <w:spacing w:val="0"/>
                 <w:w w:val="100"/>
                 <w:sz w:val="14"/>
-                <w:szCs w:val="16"/>
+                <w:szCs w:val="14"/>
                 <w:lang w:val="ro-RO"/>
               </w:rPr>
               <w:t>LOC DE ADUNARE ÎN CAZ DE EVACUARE</w:t>
@@ -3984,7 +4033,7 @@
     <w:p>
       <w:pPr>
         <w:pStyle w:val="Normal"/>
-        <w:keepNext w:val="true"/>
+        <w:keepNext w:val="false"/>
         <w:widowControl/>
         <w:spacing w:before="120" w:after="0"/>
         <w:ind w:hanging="0"/>
@@ -4026,7 +4075,7 @@
           <w:szCs w:val="20"/>
           <w:lang w:val="ro-RO"/>
         </w:rPr>
-        <w:t>(ANGAJARE)</w:t>
+        <w:t>(ANGAJARE / REINSTRUIRE)</w:t>
       </w:r>
     </w:p>
     <w:p>
@@ -4076,6 +4125,8 @@
     <w:p>
       <w:pPr>
         <w:pStyle w:val="Normal"/>
+        <w:keepNext w:val="true"/>
+        <w:keepLines w:val="true"/>
         <w:widowControl/>
         <w:numPr>
           <w:ilvl w:val="0"/>
@@ -4099,12 +4150,14 @@
           <w:szCs w:val="20"/>
           <w:lang w:val="ro-RO"/>
         </w:rPr>
-        <w:t>Legea nr.: 90/ 2002;</w:t>
+        <w:t>Legea nr. 90/ 2002;</w:t>
       </w:r>
     </w:p>
     <w:p>
       <w:pPr>
         <w:pStyle w:val="Normal"/>
+        <w:keepNext w:val="true"/>
+        <w:keepLines w:val="true"/>
         <w:widowControl/>
         <w:numPr>
           <w:ilvl w:val="0"/>
@@ -4128,12 +4181,13 @@
           <w:szCs w:val="20"/>
           <w:lang w:val="ro-RO"/>
         </w:rPr>
-        <w:t>Legea nr.: 319/ 2006;</w:t>
+        <w:t>Legea nr. 319/ 2006;</w:t>
       </w:r>
     </w:p>
     <w:p>
       <w:pPr>
         <w:pStyle w:val="Normal"/>
+        <w:keepLines w:val="true"/>
         <w:widowControl/>
         <w:numPr>
           <w:ilvl w:val="0"/>
@@ -4207,6 +4261,8 @@
     <w:p>
       <w:pPr>
         <w:pStyle w:val="Normal"/>
+        <w:keepNext w:val="true"/>
+        <w:keepLines w:val="true"/>
         <w:widowControl/>
         <w:numPr>
           <w:ilvl w:val="0"/>
@@ -4237,6 +4293,8 @@
     <w:p>
       <w:pPr>
         <w:pStyle w:val="Normal"/>
+        <w:keepNext w:val="true"/>
+        <w:keepLines w:val="true"/>
         <w:widowControl/>
         <w:numPr>
           <w:ilvl w:val="0"/>
@@ -4266,6 +4324,7 @@
     <w:p>
       <w:pPr>
         <w:pStyle w:val="Normal"/>
+        <w:keepLines w:val="true"/>
         <w:widowControl/>
         <w:numPr>
           <w:ilvl w:val="0"/>
@@ -4340,6 +4399,8 @@
     <w:p>
       <w:pPr>
         <w:pStyle w:val="Normal"/>
+        <w:keepNext w:val="true"/>
+        <w:keepLines w:val="true"/>
         <w:widowControl/>
         <w:numPr>
           <w:ilvl w:val="0"/>
@@ -4370,6 +4431,8 @@
     <w:p>
       <w:pPr>
         <w:pStyle w:val="Normal"/>
+        <w:keepNext w:val="true"/>
+        <w:keepLines w:val="true"/>
         <w:widowControl/>
         <w:numPr>
           <w:ilvl w:val="0"/>
@@ -4400,6 +4463,7 @@
     <w:p>
       <w:pPr>
         <w:pStyle w:val="Normal"/>
+        <w:keepLines w:val="true"/>
         <w:widowControl/>
         <w:numPr>
           <w:ilvl w:val="0"/>
@@ -4474,6 +4538,8 @@
     <w:p>
       <w:pPr>
         <w:pStyle w:val="Normal"/>
+        <w:keepNext w:val="true"/>
+        <w:keepLines w:val="true"/>
         <w:widowControl/>
         <w:numPr>
           <w:ilvl w:val="0"/>
@@ -4503,6 +4569,8 @@
     <w:p>
       <w:pPr>
         <w:pStyle w:val="Normal"/>
+        <w:keepNext w:val="true"/>
+        <w:keepLines w:val="true"/>
         <w:widowControl/>
         <w:numPr>
           <w:ilvl w:val="0"/>
@@ -4532,6 +4600,7 @@
     <w:p>
       <w:pPr>
         <w:pStyle w:val="Normal"/>
+        <w:keepLines w:val="true"/>
         <w:widowControl/>
         <w:numPr>
           <w:ilvl w:val="0"/>
@@ -4604,6 +4673,8 @@
     <w:p>
       <w:pPr>
         <w:pStyle w:val="Normal"/>
+        <w:keepNext w:val="true"/>
+        <w:keepLines w:val="true"/>
         <w:widowControl/>
         <w:numPr>
           <w:ilvl w:val="0"/>
@@ -4634,6 +4705,8 @@
     <w:p>
       <w:pPr>
         <w:pStyle w:val="Normal"/>
+        <w:keepNext w:val="true"/>
+        <w:keepLines w:val="true"/>
         <w:widowControl/>
         <w:numPr>
           <w:ilvl w:val="0"/>
@@ -4664,6 +4737,7 @@
     <w:p>
       <w:pPr>
         <w:pStyle w:val="Normal"/>
+        <w:keepLines w:val="true"/>
         <w:widowControl/>
         <w:numPr>
           <w:ilvl w:val="0"/>
@@ -4738,6 +4812,8 @@
     <w:p>
       <w:pPr>
         <w:pStyle w:val="BodyText"/>
+        <w:keepNext w:val="true"/>
+        <w:keepLines w:val="true"/>
         <w:widowControl/>
         <w:numPr>
           <w:ilvl w:val="0"/>
@@ -4768,6 +4844,8 @@
     <w:p>
       <w:pPr>
         <w:pStyle w:val="BodyText"/>
+        <w:keepNext w:val="true"/>
+        <w:keepLines w:val="true"/>
         <w:widowControl/>
         <w:numPr>
           <w:ilvl w:val="0"/>
@@ -4798,6 +4876,7 @@
     <w:p>
       <w:pPr>
         <w:pStyle w:val="BodyText"/>
+        <w:keepLines w:val="true"/>
         <w:widowControl/>
         <w:numPr>
           <w:ilvl w:val="0"/>
@@ -4872,6 +4951,8 @@
     <w:p>
       <w:pPr>
         <w:pStyle w:val="Normal"/>
+        <w:keepNext w:val="true"/>
+        <w:keepLines w:val="true"/>
         <w:widowControl/>
         <w:numPr>
           <w:ilvl w:val="0"/>
@@ -4902,6 +4983,8 @@
     <w:p>
       <w:pPr>
         <w:pStyle w:val="Normal"/>
+        <w:keepNext w:val="true"/>
+        <w:keepLines w:val="true"/>
         <w:widowControl/>
         <w:numPr>
           <w:ilvl w:val="0"/>
@@ -4932,6 +5015,7 @@
     <w:p>
       <w:pPr>
         <w:pStyle w:val="Normal"/>
+        <w:keepLines w:val="true"/>
         <w:widowControl/>
         <w:numPr>
           <w:ilvl w:val="0"/>
@@ -5006,6 +5090,8 @@
     <w:p>
       <w:pPr>
         <w:pStyle w:val="Normal"/>
+        <w:keepNext w:val="true"/>
+        <w:keepLines w:val="true"/>
         <w:widowControl/>
         <w:numPr>
           <w:ilvl w:val="0"/>
@@ -5035,6 +5121,8 @@
     <w:p>
       <w:pPr>
         <w:pStyle w:val="Normal"/>
+        <w:keepNext w:val="true"/>
+        <w:keepLines w:val="true"/>
         <w:widowControl/>
         <w:numPr>
           <w:ilvl w:val="0"/>
@@ -5065,6 +5153,7 @@
     <w:p>
       <w:pPr>
         <w:pStyle w:val="Normal"/>
+        <w:keepLines w:val="true"/>
         <w:widowControl/>
         <w:numPr>
           <w:ilvl w:val="0"/>
@@ -5139,6 +5228,8 @@
     <w:p>
       <w:pPr>
         <w:pStyle w:val="Normal"/>
+        <w:keepNext w:val="true"/>
+        <w:keepLines w:val="true"/>
         <w:widowControl/>
         <w:numPr>
           <w:ilvl w:val="1"/>
@@ -5169,6 +5260,8 @@
     <w:p>
       <w:pPr>
         <w:pStyle w:val="Normal"/>
+        <w:keepNext w:val="true"/>
+        <w:keepLines w:val="true"/>
         <w:widowControl/>
         <w:numPr>
           <w:ilvl w:val="1"/>
@@ -5199,6 +5292,7 @@
     <w:p>
       <w:pPr>
         <w:pStyle w:val="Normal"/>
+        <w:keepLines w:val="true"/>
         <w:widowControl/>
         <w:numPr>
           <w:ilvl w:val="1"/>
@@ -5288,6 +5382,8 @@
     <w:p>
       <w:pPr>
         <w:pStyle w:val="Normal"/>
+        <w:keepNext w:val="true"/>
+        <w:keepLines w:val="true"/>
         <w:widowControl/>
         <w:numPr>
           <w:ilvl w:val="0"/>
@@ -5319,6 +5415,7 @@
       <w:pPr>
         <w:pStyle w:val="Normal"/>
         <w:keepNext w:val="true"/>
+        <w:keepLines w:val="true"/>
         <w:widowControl/>
         <w:numPr>
           <w:ilvl w:val="0"/>
@@ -6013,6 +6110,10 @@
               <w:bottom w:val="single" w:sz="4" w:space="0" w:color="000000"/>
               <w:right w:val="double" w:sz="4" w:space="0" w:color="000000"/>
             </w:tcBorders>
+            <w:tcMar>
+              <w:top w:w="57" w:type="dxa"/>
+              <w:bottom w:w="57" w:type="dxa"/>
+            </w:tcMar>
             <w:vAlign w:val="center"/>
           </w:tcPr>
           <w:p>
@@ -6025,8 +6126,8 @@
                 <w:rFonts w:ascii="Arial" w:hAnsi="Arial" w:cs="Arial"/>
                 <w:b/>
                 <w:bCs/>
-                <w:sz w:val="16"/>
-                <w:szCs w:val="16"/>
+                <w:sz w:val="14"/>
+                <w:szCs w:val="14"/>
                 <w:lang w:val="fr-FR"/>
               </w:rPr>
             </w:pPr>
@@ -6038,7 +6139,7 @@
                 <w:spacing w:val="0"/>
                 <w:w w:val="100"/>
                 <w:sz w:val="14"/>
-                <w:szCs w:val="16"/>
+                <w:szCs w:val="14"/>
                 <w:lang w:val="ro-RO"/>
               </w:rPr>
               <w:t>INTERZIS ACCESUL PIETONILOR</w:t>
@@ -6054,6 +6155,10 @@
               <w:bottom w:val="single" w:sz="4" w:space="0" w:color="000000"/>
               <w:right w:val="double" w:sz="4" w:space="0" w:color="000000"/>
             </w:tcBorders>
+            <w:tcMar>
+              <w:top w:w="57" w:type="dxa"/>
+              <w:bottom w:w="57" w:type="dxa"/>
+            </w:tcMar>
             <w:vAlign w:val="center"/>
           </w:tcPr>
           <w:p>
@@ -6061,14 +6166,13 @@
               <w:pStyle w:val="Normal"/>
               <w:widowControl/>
               <w:spacing w:before="0" w:after="0"/>
-              <w:ind w:left="-155" w:right="-108"/>
               <w:jc w:val="center"/>
               <w:rPr>
                 <w:rFonts w:ascii="Arial" w:hAnsi="Arial" w:cs="Arial"/>
                 <w:b/>
                 <w:bCs/>
-                <w:sz w:val="16"/>
-                <w:szCs w:val="16"/>
+                <w:sz w:val="14"/>
+                <w:szCs w:val="14"/>
                 <w:lang w:val="pt-BR"/>
               </w:rPr>
             </w:pPr>
@@ -6080,10 +6184,10 @@
                 <w:spacing w:val="0"/>
                 <w:w w:val="100"/>
                 <w:sz w:val="14"/>
-                <w:szCs w:val="16"/>
+                <w:szCs w:val="14"/>
                 <w:lang w:val="ro-RO"/>
               </w:rPr>
-              <w:t>NU ATINGE! PERICOL DE ELECTROCUTARE</w:t>
+              <w:t>NU ATINGE! PERICOL DE ELECTRO­CUTARE</w:t>
             </w:r>
           </w:p>
         </w:tc>
@@ -6096,6 +6200,10 @@
               <w:bottom w:val="single" w:sz="4" w:space="0" w:color="000000"/>
               <w:right w:val="double" w:sz="4" w:space="0" w:color="000000"/>
             </w:tcBorders>
+            <w:tcMar>
+              <w:top w:w="57" w:type="dxa"/>
+              <w:bottom w:w="57" w:type="dxa"/>
+            </w:tcMar>
             <w:vAlign w:val="center"/>
           </w:tcPr>
           <w:p>
@@ -6120,7 +6228,7 @@
                 <w:spacing w:val="0"/>
                 <w:w w:val="100"/>
                 <w:sz w:val="14"/>
-                <w:szCs w:val="16"/>
+                <w:szCs w:val="14"/>
                 <w:lang w:val="ro-RO"/>
               </w:rPr>
               <w:t>MATERIALE INFLAMABILE</w:t>
@@ -6136,6 +6244,10 @@
               <w:bottom w:val="single" w:sz="4" w:space="0" w:color="000000"/>
               <w:right w:val="double" w:sz="4" w:space="0" w:color="000000"/>
             </w:tcBorders>
+            <w:tcMar>
+              <w:top w:w="57" w:type="dxa"/>
+              <w:bottom w:w="57" w:type="dxa"/>
+            </w:tcMar>
             <w:vAlign w:val="center"/>
           </w:tcPr>
           <w:p>
@@ -6148,8 +6260,8 @@
                 <w:rFonts w:ascii="Arial" w:hAnsi="Arial" w:cs="Arial"/>
                 <w:b/>
                 <w:bCs/>
-                <w:sz w:val="16"/>
-                <w:szCs w:val="16"/>
+                <w:sz w:val="14"/>
+                <w:szCs w:val="14"/>
                 <w:lang w:val="fr-FR"/>
               </w:rPr>
             </w:pPr>
@@ -6161,7 +6273,7 @@
                 <w:spacing w:val="0"/>
                 <w:w w:val="100"/>
                 <w:sz w:val="14"/>
-                <w:szCs w:val="16"/>
+                <w:szCs w:val="14"/>
                 <w:lang w:val="ro-RO"/>
               </w:rPr>
               <w:t>PERICOL GENERAL</w:t>
@@ -6177,6 +6289,10 @@
               <w:bottom w:val="single" w:sz="4" w:space="0" w:color="000000"/>
               <w:right w:val="double" w:sz="4" w:space="0" w:color="000000"/>
             </w:tcBorders>
+            <w:tcMar>
+              <w:top w:w="57" w:type="dxa"/>
+              <w:bottom w:w="57" w:type="dxa"/>
+            </w:tcMar>
             <w:vAlign w:val="center"/>
           </w:tcPr>
           <w:p>
@@ -6202,7 +6318,7 @@
                 <w:spacing w:val="0"/>
                 <w:w w:val="100"/>
                 <w:sz w:val="14"/>
-                <w:szCs w:val="16"/>
+                <w:szCs w:val="14"/>
                 <w:lang w:val="ro-RO"/>
               </w:rPr>
               <w:t>PROTECȚIA MÂINILOR OBLIGATORIE</w:t>
@@ -6218,6 +6334,10 @@
               <w:bottom w:val="single" w:sz="4" w:space="0" w:color="000000"/>
               <w:right w:val="double" w:sz="4" w:space="0" w:color="000000"/>
             </w:tcBorders>
+            <w:tcMar>
+              <w:top w:w="57" w:type="dxa"/>
+              <w:bottom w:w="57" w:type="dxa"/>
+            </w:tcMar>
             <w:vAlign w:val="center"/>
           </w:tcPr>
           <w:p>
@@ -6230,8 +6350,8 @@
                 <w:rFonts w:ascii="Arial" w:hAnsi="Arial" w:cs="Arial"/>
                 <w:b/>
                 <w:bCs/>
-                <w:sz w:val="16"/>
-                <w:szCs w:val="16"/>
+                <w:sz w:val="14"/>
+                <w:szCs w:val="14"/>
                 <w:lang w:val="fr-FR"/>
               </w:rPr>
             </w:pPr>
@@ -6243,7 +6363,7 @@
                 <w:spacing w:val="0"/>
                 <w:w w:val="100"/>
                 <w:sz w:val="14"/>
-                <w:szCs w:val="16"/>
+                <w:szCs w:val="14"/>
                 <w:lang w:val="ro-RO"/>
               </w:rPr>
               <w:t>LOC DE FUMAT</w:t>
@@ -6259,6 +6379,10 @@
               <w:bottom w:val="single" w:sz="4" w:space="0" w:color="000000"/>
               <w:right w:val="double" w:sz="4" w:space="0" w:color="000000"/>
             </w:tcBorders>
+            <w:tcMar>
+              <w:top w:w="57" w:type="dxa"/>
+              <w:bottom w:w="57" w:type="dxa"/>
+            </w:tcMar>
             <w:vAlign w:val="center"/>
           </w:tcPr>
           <w:p>
@@ -6271,8 +6395,8 @@
                 <w:rFonts w:ascii="Arial" w:hAnsi="Arial" w:cs="Arial"/>
                 <w:b/>
                 <w:bCs/>
-                <w:sz w:val="16"/>
-                <w:szCs w:val="16"/>
+                <w:sz w:val="14"/>
+                <w:szCs w:val="14"/>
                 <w:lang w:val="fr-FR"/>
               </w:rPr>
             </w:pPr>
@@ -6284,7 +6408,7 @@
                 <w:spacing w:val="0"/>
                 <w:w w:val="100"/>
                 <w:sz w:val="14"/>
-                <w:szCs w:val="16"/>
+                <w:szCs w:val="14"/>
                 <w:lang w:val="ro-RO"/>
               </w:rPr>
               <w:t>STINGĂTOR</w:t>
@@ -6300,6 +6424,10 @@
               <w:bottom w:val="single" w:sz="4" w:space="0" w:color="000000"/>
               <w:right w:val="single" w:sz="4" w:space="0" w:color="000000"/>
             </w:tcBorders>
+            <w:tcMar>
+              <w:top w:w="57" w:type="dxa"/>
+              <w:bottom w:w="57" w:type="dxa"/>
+            </w:tcMar>
             <w:vAlign w:val="center"/>
           </w:tcPr>
           <w:p>
@@ -6312,8 +6440,8 @@
                 <w:rFonts w:ascii="Arial" w:hAnsi="Arial" w:cs="Arial"/>
                 <w:b/>
                 <w:bCs/>
-                <w:sz w:val="16"/>
-                <w:szCs w:val="16"/>
+                <w:sz w:val="14"/>
+                <w:szCs w:val="14"/>
                 <w:lang w:val="fr-FR"/>
               </w:rPr>
             </w:pPr>
@@ -6325,7 +6453,7 @@
                 <w:spacing w:val="0"/>
                 <w:w w:val="100"/>
                 <w:sz w:val="14"/>
-                <w:szCs w:val="16"/>
+                <w:szCs w:val="14"/>
                 <w:lang w:val="ro-RO"/>
               </w:rPr>
               <w:t>LOC DE ADUNARE ÎN CAZ DE EVACUARE</w:t>

</xml_diff>

<commit_message>
fix(templates): a comma, "semnal de avertizare" and "etc." in the two tests
5.1 Q5 c): "…conducătorul locului de muncă, iar în cazul…". 5.2 Q2 c): "roșu – semnal de
avertizare"; Q12: "(reparații, reglaje etc.)". Questions and answer keys are unchanged.

Claude-Session: https://claude.ai/code/session_01A9qjCHVH6kcDAEKFiJoShR
</commit_message>
<xml_diff>
--- a/packages/document-engine/templates/5.1_test_hiring.docx
+++ b/packages/document-engine/templates/5.1_test_hiring.docx
@@ -718,7 +718,7 @@
           <w:szCs w:val="20"/>
           <w:lang w:val="ro-RO"/>
         </w:rPr>
-        <w:t>să anunțe imediat conducătorul locului de muncă iar în cazul producerii unor accidente mortale sau colective să nu intervină neautorizat pentru modificarea stării de fapt.</w:t>
+        <w:t xml:space="preserve">să anunțe imediat conducătorul locului de muncă, iar în cazul producerii unor accidente mortale sau colective să nu intervină neautorizat pentru modificarea stării de fapt.</w:t>
       </w:r>
     </w:p>
     <w:p>
@@ -4762,7 +4762,7 @@
           <w:szCs w:val="20"/>
           <w:lang w:val="ro-RO"/>
         </w:rPr>
-        <w:t>să anunțe imediat conducătorul locului de muncă iar în cazul producerii unor accidente mortale sau colective să nu intervină neautorizat pentru modificarea stării de fapt.</w:t>
+        <w:t xml:space="preserve">să anunțe imediat conducătorul locului de muncă, iar în cazul producerii unor accidente mortale sau colective să nu intervină neautorizat pentru modificarea stării de fapt.</w:t>
       </w:r>
     </w:p>
     <w:p>

</xml_diff>

<commit_message>
fix(templates): the hiring test asks for the name of the commuting accident
Question 4 read "În ce categorie de accidente se includ accidentele produse în timpul deplasării de la domiciliu la locul de muncă?", to which "Accident de muncă" is also defensible (Legea 319 counts a commuting accident as a work accident). It now reads "Cum se numește accidentul produs pe traseul normal dintre domiciliu și locul de muncă?" on the test and on the key page; the answers and the key (C, "Accident de traseu") stay.

Claude-Session: https://claude.ai/code/session_01A9qjCHVH6kcDAEKFiJoShR
</commit_message>
<xml_diff>
--- a/packages/document-engine/templates/5.1_test_hiring.docx
+++ b/packages/document-engine/templates/5.1_test_hiring.docx
@@ -488,7 +488,7 @@
           <w:szCs w:val="20"/>
           <w:lang w:val="ro-RO"/>
         </w:rPr>
-        <w:t xml:space="preserve"> În ce categorie de accidente se includ accidentele produse în timpul deplasării de la domiciliu la locul de muncă?</w:t>
+        <w:t xml:space="preserve"> Cum se numește accidentul produs pe traseul normal dintre domiciliu și locul de muncă?</w:t>
       </w:r>
     </w:p>
     <w:p>
@@ -4532,7 +4532,7 @@
           <w:szCs w:val="20"/>
           <w:lang w:val="ro-RO"/>
         </w:rPr>
-        <w:t xml:space="preserve"> În ce categorie de accidente se includ accidentele produse în timpul deplasării de la domiciliu la locul de muncă?</w:t>
+        <w:t xml:space="preserve"> Cum se numește accidentul produs pe traseul normal dintre domiciliu și locul de muncă?</w:t>
       </w:r>
     </w:p>
     <w:p>

</xml_diff>

<commit_message>
fix(templates): the hiring test's signs question has one wrong caption, so its key NU holds
Claude-Session: https://claude.ai/code/session_01A9qjCHVH6kcDAEKFiJoShR
</commit_message>
<xml_diff>
--- a/packages/document-engine/templates/5.1_test_hiring.docx
+++ b/packages/document-engine/templates/5.1_test_hiring.docx
@@ -2367,7 +2367,7 @@
                 <w:szCs w:val="14"/>
                 <w:lang w:val="ro-RO"/>
               </w:rPr>
-              <w:t>STINGĂTOR</w:t>
+              <w:t xml:space="preserve">HIDRANT</w:t>
             </w:r>
           </w:p>
         </w:tc>
@@ -6411,7 +6411,7 @@
                 <w:szCs w:val="14"/>
                 <w:lang w:val="ro-RO"/>
               </w:rPr>
-              <w:t>STINGĂTOR</w:t>
+              <w:t xml:space="preserve">HIDRANT</w:t>
             </w:r>
           </w:p>
         </w:tc>

</xml_diff>